<commit_message>
fix(docs): pageBreakBefore via Heading 1 style for compatibility
Some readers (Pages, Quick Look) reject paragraphs that combine
pageBreakBefore=true with a TextRun(break:1) inside the same paragraph.
Move page-break behavior to the Heading 1 style itself — every h1
implicitly starts on a new page, no synthetic break paragraphs.

DOCX validated end-to-end with textutil (extracts 754 lines of text
correctly), XML lints clean.

Co-Authored-By: Claude Opus 4.7 (1M context) <noreply@anthropic.com>
</commit_message>
<xml_diff>
--- a/docs/comportamiento-agente-v1-vs-v2.docx
+++ b/docs/comportamiento-agente-v1-vs-v2.docx
@@ -84,16 +84,8 @@
     </w:p>
     <w:p>
       <w:pPr>
+        <w:pStyle w:val="Heading1"/>
         <w:pageBreakBefore/>
-      </w:pPr>
-      <w:r>
-        <w:br/>
-        <w:t xml:space="preserve"/>
-      </w:r>
-    </w:p>
-    <w:p>
-      <w:pPr>
-        <w:pStyle w:val="Heading1"/>
         <w:spacing w:after="200" w:before="360"/>
       </w:pPr>
       <w:r>
@@ -361,16 +353,8 @@
     </w:p>
     <w:p>
       <w:pPr>
+        <w:pStyle w:val="Heading1"/>
         <w:pageBreakBefore/>
-      </w:pPr>
-      <w:r>
-        <w:br/>
-        <w:t xml:space="preserve"/>
-      </w:r>
-    </w:p>
-    <w:p>
-      <w:pPr>
-        <w:pStyle w:val="Heading1"/>
         <w:spacing w:after="200" w:before="360"/>
       </w:pPr>
       <w:r>
@@ -836,16 +820,8 @@
     </w:p>
     <w:p>
       <w:pPr>
+        <w:pStyle w:val="Heading1"/>
         <w:pageBreakBefore/>
-      </w:pPr>
-      <w:r>
-        <w:br/>
-        <w:t xml:space="preserve"/>
-      </w:r>
-    </w:p>
-    <w:p>
-      <w:pPr>
-        <w:pStyle w:val="Heading1"/>
         <w:spacing w:after="200" w:before="360"/>
       </w:pPr>
       <w:r>
@@ -2548,16 +2524,8 @@
     </w:tbl>
     <w:p>
       <w:pPr>
+        <w:pStyle w:val="Heading1"/>
         <w:pageBreakBefore/>
-      </w:pPr>
-      <w:r>
-        <w:br/>
-        <w:t xml:space="preserve"/>
-      </w:r>
-    </w:p>
-    <w:p>
-      <w:pPr>
-        <w:pStyle w:val="Heading1"/>
         <w:spacing w:after="200" w:before="360"/>
       </w:pPr>
       <w:r>
@@ -4301,16 +4269,8 @@
     </w:tbl>
     <w:p>
       <w:pPr>
+        <w:pStyle w:val="Heading1"/>
         <w:pageBreakBefore/>
-      </w:pPr>
-      <w:r>
-        <w:br/>
-        <w:t xml:space="preserve"/>
-      </w:r>
-    </w:p>
-    <w:p>
-      <w:pPr>
-        <w:pStyle w:val="Heading1"/>
         <w:spacing w:after="200" w:before="360"/>
       </w:pPr>
       <w:r>
@@ -5555,16 +5515,8 @@
     </w:tbl>
     <w:p>
       <w:pPr>
+        <w:pStyle w:val="Heading1"/>
         <w:pageBreakBefore/>
-      </w:pPr>
-      <w:r>
-        <w:br/>
-        <w:t xml:space="preserve"/>
-      </w:r>
-    </w:p>
-    <w:p>
-      <w:pPr>
-        <w:pStyle w:val="Heading1"/>
         <w:spacing w:after="200" w:before="360"/>
       </w:pPr>
       <w:r>
@@ -7411,16 +7363,8 @@
     </w:tbl>
     <w:p>
       <w:pPr>
+        <w:pStyle w:val="Heading1"/>
         <w:pageBreakBefore/>
-      </w:pPr>
-      <w:r>
-        <w:br/>
-        <w:t xml:space="preserve"/>
-      </w:r>
-    </w:p>
-    <w:p>
-      <w:pPr>
-        <w:pStyle w:val="Heading1"/>
         <w:spacing w:after="200" w:before="360"/>
       </w:pPr>
       <w:r>
@@ -8236,16 +8180,8 @@
     </w:tbl>
     <w:p>
       <w:pPr>
+        <w:pStyle w:val="Heading1"/>
         <w:pageBreakBefore/>
-      </w:pPr>
-      <w:r>
-        <w:br/>
-        <w:t xml:space="preserve"/>
-      </w:r>
-    </w:p>
-    <w:p>
-      <w:pPr>
-        <w:pStyle w:val="Heading1"/>
         <w:spacing w:after="200" w:before="360"/>
       </w:pPr>
       <w:r>
@@ -9481,16 +9417,8 @@
     </w:tbl>
     <w:p>
       <w:pPr>
+        <w:pStyle w:val="Heading1"/>
         <w:pageBreakBefore/>
-      </w:pPr>
-      <w:r>
-        <w:br/>
-        <w:t xml:space="preserve"/>
-      </w:r>
-    </w:p>
-    <w:p>
-      <w:pPr>
-        <w:pStyle w:val="Heading1"/>
         <w:spacing w:after="200" w:before="360"/>
       </w:pPr>
       <w:r>
@@ -11255,16 +11183,8 @@
     </w:tbl>
     <w:p>
       <w:pPr>
+        <w:pStyle w:val="Heading1"/>
         <w:pageBreakBefore/>
-      </w:pPr>
-      <w:r>
-        <w:br/>
-        <w:t xml:space="preserve"/>
-      </w:r>
-    </w:p>
-    <w:p>
-      <w:pPr>
-        <w:pStyle w:val="Heading1"/>
         <w:spacing w:after="200" w:before="360"/>
       </w:pPr>
       <w:r>
@@ -12167,16 +12087,8 @@
     </w:tbl>
     <w:p>
       <w:pPr>
+        <w:pStyle w:val="Heading1"/>
         <w:pageBreakBefore/>
-      </w:pPr>
-      <w:r>
-        <w:br/>
-        <w:t xml:space="preserve"/>
-      </w:r>
-    </w:p>
-    <w:p>
-      <w:pPr>
-        <w:pStyle w:val="Heading1"/>
         <w:spacing w:after="200" w:before="360"/>
       </w:pPr>
       <w:r>
@@ -15178,16 +15090,8 @@
     </w:tbl>
     <w:p>
       <w:pPr>
+        <w:pStyle w:val="Heading1"/>
         <w:pageBreakBefore/>
-      </w:pPr>
-      <w:r>
-        <w:br/>
-        <w:t xml:space="preserve"/>
-      </w:r>
-    </w:p>
-    <w:p>
-      <w:pPr>
-        <w:pStyle w:val="Heading1"/>
         <w:spacing w:after="200" w:before="360"/>
       </w:pPr>
       <w:r>
@@ -18480,6 +18384,7 @@
     <w:next w:val="Normal"/>
     <w:qFormat/>
     <w:pPr>
+      <w:pageBreakBefore/>
       <w:spacing w:after="200" w:before="360"/>
       <w:outlineLvl w:val="0"/>
     </w:pPr>

</xml_diff>